<commit_message>
yeet alda meine fresse
</commit_message>
<xml_diff>
--- a/QR Codes.docx
+++ b/QR Codes.docx
@@ -18,27 +18,26 @@
             <w:tcW w:w="4531" w:type="dxa"/>
           </w:tcPr>
           <w:p>
-            <w:proofErr w:type="spellStart"/>
-            <w:r>
-              <w:t>Get</w:t>
-            </w:r>
-            <w:proofErr w:type="spellEnd"/>
-            <w:r>
-              <w:t xml:space="preserve"> </w:t>
-            </w:r>
-            <w:proofErr w:type="spellStart"/>
-            <w:r>
-              <w:t>Frequency</w:t>
-            </w:r>
-            <w:proofErr w:type="spellEnd"/>
-          </w:p>
-        </w:tc>
-        <w:tc>
-          <w:tcPr>
-            <w:tcW w:w="4531" w:type="dxa"/>
-          </w:tcPr>
-          <w:p>
-            <w:r>
+            <w:pPr>
+              <w:jc w:val="center"/>
+            </w:pPr>
+            <w:r>
+              <w:t>Get Frequency</w:t>
+            </w:r>
+          </w:p>
+        </w:tc>
+        <w:tc>
+          <w:tcPr>
+            <w:tcW w:w="4531" w:type="dxa"/>
+          </w:tcPr>
+          <w:p>
+            <w:pPr>
+              <w:jc w:val="center"/>
+            </w:pPr>
+            <w:r>
+              <w:rPr>
+                <w:noProof/>
+              </w:rPr>
               <w:drawing>
                 <wp:inline distT="0" distB="0" distL="0" distR="0" wp14:anchorId="48E4889E" wp14:editId="290B1DA8">
                   <wp:extent cx="2329229" cy="2339290"/>
@@ -84,22 +83,26 @@
             <w:tcW w:w="4531" w:type="dxa"/>
           </w:tcPr>
           <w:p>
-            <w:proofErr w:type="spellStart"/>
-            <w:r>
-              <w:t>Divert</w:t>
-            </w:r>
-            <w:proofErr w:type="spellEnd"/>
-            <w:r>
-              <w:t xml:space="preserve"> Power</w:t>
-            </w:r>
-          </w:p>
-        </w:tc>
-        <w:tc>
-          <w:tcPr>
-            <w:tcW w:w="4531" w:type="dxa"/>
-          </w:tcPr>
-          <w:p>
-            <w:r>
+            <w:pPr>
+              <w:jc w:val="center"/>
+            </w:pPr>
+            <w:r>
+              <w:t>Divert Power</w:t>
+            </w:r>
+          </w:p>
+        </w:tc>
+        <w:tc>
+          <w:tcPr>
+            <w:tcW w:w="4531" w:type="dxa"/>
+          </w:tcPr>
+          <w:p>
+            <w:pPr>
+              <w:jc w:val="center"/>
+            </w:pPr>
+            <w:r>
+              <w:rPr>
+                <w:noProof/>
+              </w:rPr>
               <w:drawing>
                 <wp:inline distT="0" distB="0" distL="0" distR="0" wp14:anchorId="10C3042F" wp14:editId="59F67B58">
                   <wp:extent cx="2274277" cy="2279376"/>
@@ -145,22 +148,26 @@
             <w:tcW w:w="4531" w:type="dxa"/>
           </w:tcPr>
           <w:p>
-            <w:proofErr w:type="spellStart"/>
-            <w:r>
-              <w:t>Accept</w:t>
-            </w:r>
-            <w:proofErr w:type="spellEnd"/>
-            <w:r>
-              <w:t xml:space="preserve"> Power (Shields)</w:t>
-            </w:r>
-          </w:p>
-        </w:tc>
-        <w:tc>
-          <w:tcPr>
-            <w:tcW w:w="4531" w:type="dxa"/>
-          </w:tcPr>
-          <w:p>
-            <w:r>
+            <w:pPr>
+              <w:jc w:val="center"/>
+            </w:pPr>
+            <w:r>
+              <w:t>Accept Power (Shields)</w:t>
+            </w:r>
+          </w:p>
+        </w:tc>
+        <w:tc>
+          <w:tcPr>
+            <w:tcW w:w="4531" w:type="dxa"/>
+          </w:tcPr>
+          <w:p>
+            <w:pPr>
+              <w:jc w:val="center"/>
+            </w:pPr>
+            <w:r>
+              <w:rPr>
+                <w:noProof/>
+              </w:rPr>
               <w:drawing>
                 <wp:inline distT="0" distB="0" distL="0" distR="0" wp14:anchorId="1836309F" wp14:editId="3F56784B">
                   <wp:extent cx="2098431" cy="2127711"/>
@@ -206,6 +213,9 @@
             <w:tcW w:w="4531" w:type="dxa"/>
           </w:tcPr>
           <w:p>
+            <w:pPr>
+              <w:jc w:val="center"/>
+            </w:pPr>
             <w:r>
               <w:lastRenderedPageBreak/>
               <w:t>Download Data (Shields)</w:t>
@@ -217,7 +227,13 @@
             <w:tcW w:w="4531" w:type="dxa"/>
           </w:tcPr>
           <w:p>
-            <w:r>
+            <w:pPr>
+              <w:jc w:val="center"/>
+            </w:pPr>
+            <w:r>
+              <w:rPr>
+                <w:noProof/>
+              </w:rPr>
               <w:drawing>
                 <wp:inline distT="0" distB="0" distL="0" distR="0" wp14:anchorId="107009A9" wp14:editId="410DE350">
                   <wp:extent cx="2525317" cy="2508739"/>
@@ -263,6 +279,9 @@
             <w:tcW w:w="4531" w:type="dxa"/>
           </w:tcPr>
           <w:p>
+            <w:pPr>
+              <w:jc w:val="center"/>
+            </w:pPr>
             <w:r>
               <w:t>Upload Data</w:t>
             </w:r>
@@ -274,9 +293,12 @@
           </w:tcPr>
           <w:p>
             <w:pPr>
-              <w:jc w:val="right"/>
-            </w:pPr>
-            <w:r>
+              <w:jc w:val="center"/>
+            </w:pPr>
+            <w:r>
+              <w:rPr>
+                <w:noProof/>
+              </w:rPr>
               <w:drawing>
                 <wp:inline distT="0" distB="0" distL="0" distR="0" wp14:anchorId="0E8D22AE" wp14:editId="6249F970">
                   <wp:extent cx="2260950" cy="2321169"/>
@@ -321,45 +343,561 @@
           <w:tcPr>
             <w:tcW w:w="4531" w:type="dxa"/>
           </w:tcPr>
-          <w:p/>
-        </w:tc>
-        <w:tc>
-          <w:tcPr>
-            <w:tcW w:w="4531" w:type="dxa"/>
-          </w:tcPr>
-          <w:p/>
-        </w:tc>
-      </w:tr>
-      <w:tr>
-        <w:tc>
-          <w:tcPr>
-            <w:tcW w:w="4531" w:type="dxa"/>
-          </w:tcPr>
-          <w:p/>
-        </w:tc>
-        <w:tc>
-          <w:tcPr>
-            <w:tcW w:w="4531" w:type="dxa"/>
-          </w:tcPr>
-          <w:p/>
-        </w:tc>
-      </w:tr>
-      <w:tr>
-        <w:tc>
-          <w:tcPr>
-            <w:tcW w:w="4531" w:type="dxa"/>
-          </w:tcPr>
-          <w:p/>
-        </w:tc>
-        <w:tc>
-          <w:tcPr>
-            <w:tcW w:w="4531" w:type="dxa"/>
-          </w:tcPr>
-          <w:p/>
+          <w:p>
+            <w:pPr>
+              <w:jc w:val="center"/>
+            </w:pPr>
+            <w:r>
+              <w:t>Start Reactor</w:t>
+            </w:r>
+          </w:p>
+        </w:tc>
+        <w:tc>
+          <w:tcPr>
+            <w:tcW w:w="4531" w:type="dxa"/>
+          </w:tcPr>
+          <w:p>
+            <w:pPr>
+              <w:jc w:val="center"/>
+            </w:pPr>
+            <w:r>
+              <w:drawing>
+                <wp:inline distT="0" distB="0" distL="0" distR="0" wp14:anchorId="7C5BB9F3" wp14:editId="4D7E5A33">
+                  <wp:extent cx="2497273" cy="2508250"/>
+                  <wp:effectExtent l="0" t="0" r="0" b="6350"/>
+                  <wp:docPr id="6" name="Grafik 6"/>
+                  <wp:cNvGraphicFramePr>
+                    <a:graphicFrameLocks xmlns:a="http://schemas.openxmlformats.org/drawingml/2006/main" noChangeAspect="1"/>
+                  </wp:cNvGraphicFramePr>
+                  <a:graphic xmlns:a="http://schemas.openxmlformats.org/drawingml/2006/main">
+                    <a:graphicData uri="http://schemas.openxmlformats.org/drawingml/2006/picture">
+                      <pic:pic xmlns:pic="http://schemas.openxmlformats.org/drawingml/2006/picture">
+                        <pic:nvPicPr>
+                          <pic:cNvPr id="1" name=""/>
+                          <pic:cNvPicPr/>
+                        </pic:nvPicPr>
+                        <pic:blipFill>
+                          <a:blip r:embed="rId9"/>
+                          <a:stretch>
+                            <a:fillRect/>
+                          </a:stretch>
+                        </pic:blipFill>
+                        <pic:spPr>
+                          <a:xfrm>
+                            <a:off x="0" y="0"/>
+                            <a:ext cx="2503785" cy="2514791"/>
+                          </a:xfrm>
+                          <a:prstGeom prst="rect">
+                            <a:avLst/>
+                          </a:prstGeom>
+                        </pic:spPr>
+                      </pic:pic>
+                    </a:graphicData>
+                  </a:graphic>
+                </wp:inline>
+              </w:drawing>
+            </w:r>
+          </w:p>
+        </w:tc>
+      </w:tr>
+      <w:tr>
+        <w:tc>
+          <w:tcPr>
+            <w:tcW w:w="4531" w:type="dxa"/>
+          </w:tcPr>
+          <w:p>
+            <w:pPr>
+              <w:jc w:val="center"/>
+            </w:pPr>
+            <w:r>
+              <w:lastRenderedPageBreak/>
+              <w:t>Clear Asteroids</w:t>
+            </w:r>
+          </w:p>
+        </w:tc>
+        <w:tc>
+          <w:tcPr>
+            <w:tcW w:w="4531" w:type="dxa"/>
+          </w:tcPr>
+          <w:p>
+            <w:pPr>
+              <w:jc w:val="center"/>
+            </w:pPr>
+            <w:r>
+              <w:drawing>
+                <wp:inline distT="0" distB="0" distL="0" distR="0" wp14:anchorId="7ECF84F7" wp14:editId="756BC26D">
+                  <wp:extent cx="2543772" cy="2514600"/>
+                  <wp:effectExtent l="0" t="0" r="9525" b="0"/>
+                  <wp:docPr id="7" name="Grafik 7"/>
+                  <wp:cNvGraphicFramePr>
+                    <a:graphicFrameLocks xmlns:a="http://schemas.openxmlformats.org/drawingml/2006/main" noChangeAspect="1"/>
+                  </wp:cNvGraphicFramePr>
+                  <a:graphic xmlns:a="http://schemas.openxmlformats.org/drawingml/2006/main">
+                    <a:graphicData uri="http://schemas.openxmlformats.org/drawingml/2006/picture">
+                      <pic:pic xmlns:pic="http://schemas.openxmlformats.org/drawingml/2006/picture">
+                        <pic:nvPicPr>
+                          <pic:cNvPr id="1" name=""/>
+                          <pic:cNvPicPr/>
+                        </pic:nvPicPr>
+                        <pic:blipFill>
+                          <a:blip r:embed="rId10"/>
+                          <a:stretch>
+                            <a:fillRect/>
+                          </a:stretch>
+                        </pic:blipFill>
+                        <pic:spPr>
+                          <a:xfrm>
+                            <a:off x="0" y="0"/>
+                            <a:ext cx="2550050" cy="2520806"/>
+                          </a:xfrm>
+                          <a:prstGeom prst="rect">
+                            <a:avLst/>
+                          </a:prstGeom>
+                        </pic:spPr>
+                      </pic:pic>
+                    </a:graphicData>
+                  </a:graphic>
+                </wp:inline>
+              </w:drawing>
+            </w:r>
+          </w:p>
+        </w:tc>
+      </w:tr>
+      <w:tr>
+        <w:tc>
+          <w:tcPr>
+            <w:tcW w:w="4531" w:type="dxa"/>
+          </w:tcPr>
+          <w:p>
+            <w:pPr>
+              <w:jc w:val="center"/>
+            </w:pPr>
+            <w:r>
+              <w:t>Fill Oxygen</w:t>
+            </w:r>
+          </w:p>
+        </w:tc>
+        <w:tc>
+          <w:tcPr>
+            <w:tcW w:w="4531" w:type="dxa"/>
+          </w:tcPr>
+          <w:p>
+            <w:pPr>
+              <w:jc w:val="center"/>
+            </w:pPr>
+            <w:r>
+              <w:drawing>
+                <wp:inline distT="0" distB="0" distL="0" distR="0" wp14:anchorId="3B6CF86E" wp14:editId="2548A1BB">
+                  <wp:extent cx="2451100" cy="2585327"/>
+                  <wp:effectExtent l="0" t="0" r="6350" b="5715"/>
+                  <wp:docPr id="8" name="Grafik 8"/>
+                  <wp:cNvGraphicFramePr>
+                    <a:graphicFrameLocks xmlns:a="http://schemas.openxmlformats.org/drawingml/2006/main" noChangeAspect="1"/>
+                  </wp:cNvGraphicFramePr>
+                  <a:graphic xmlns:a="http://schemas.openxmlformats.org/drawingml/2006/main">
+                    <a:graphicData uri="http://schemas.openxmlformats.org/drawingml/2006/picture">
+                      <pic:pic xmlns:pic="http://schemas.openxmlformats.org/drawingml/2006/picture">
+                        <pic:nvPicPr>
+                          <pic:cNvPr id="1" name=""/>
+                          <pic:cNvPicPr/>
+                        </pic:nvPicPr>
+                        <pic:blipFill>
+                          <a:blip r:embed="rId11"/>
+                          <a:stretch>
+                            <a:fillRect/>
+                          </a:stretch>
+                        </pic:blipFill>
+                        <pic:spPr>
+                          <a:xfrm>
+                            <a:off x="0" y="0"/>
+                            <a:ext cx="2456548" cy="2591074"/>
+                          </a:xfrm>
+                          <a:prstGeom prst="rect">
+                            <a:avLst/>
+                          </a:prstGeom>
+                        </pic:spPr>
+                      </pic:pic>
+                    </a:graphicData>
+                  </a:graphic>
+                </wp:inline>
+              </w:drawing>
+            </w:r>
+          </w:p>
+        </w:tc>
+      </w:tr>
+      <w:tr>
+        <w:tc>
+          <w:tcPr>
+            <w:tcW w:w="4531" w:type="dxa"/>
+          </w:tcPr>
+          <w:p>
+            <w:pPr>
+              <w:jc w:val="center"/>
+            </w:pPr>
+            <w:r>
+              <w:t>Empty Oxygen</w:t>
+            </w:r>
+          </w:p>
+        </w:tc>
+        <w:tc>
+          <w:tcPr>
+            <w:tcW w:w="4531" w:type="dxa"/>
+          </w:tcPr>
+          <w:p>
+            <w:pPr>
+              <w:jc w:val="center"/>
+            </w:pPr>
+            <w:r>
+              <w:drawing>
+                <wp:inline distT="0" distB="0" distL="0" distR="0" wp14:anchorId="21AB844D" wp14:editId="2804B06E">
+                  <wp:extent cx="2470150" cy="2415135"/>
+                  <wp:effectExtent l="0" t="0" r="6350" b="4445"/>
+                  <wp:docPr id="9" name="Grafik 9"/>
+                  <wp:cNvGraphicFramePr>
+                    <a:graphicFrameLocks xmlns:a="http://schemas.openxmlformats.org/drawingml/2006/main" noChangeAspect="1"/>
+                  </wp:cNvGraphicFramePr>
+                  <a:graphic xmlns:a="http://schemas.openxmlformats.org/drawingml/2006/main">
+                    <a:graphicData uri="http://schemas.openxmlformats.org/drawingml/2006/picture">
+                      <pic:pic xmlns:pic="http://schemas.openxmlformats.org/drawingml/2006/picture">
+                        <pic:nvPicPr>
+                          <pic:cNvPr id="1" name=""/>
+                          <pic:cNvPicPr/>
+                        </pic:nvPicPr>
+                        <pic:blipFill>
+                          <a:blip r:embed="rId12"/>
+                          <a:stretch>
+                            <a:fillRect/>
+                          </a:stretch>
+                        </pic:blipFill>
+                        <pic:spPr>
+                          <a:xfrm>
+                            <a:off x="0" y="0"/>
+                            <a:ext cx="2476061" cy="2420915"/>
+                          </a:xfrm>
+                          <a:prstGeom prst="rect">
+                            <a:avLst/>
+                          </a:prstGeom>
+                        </pic:spPr>
+                      </pic:pic>
+                    </a:graphicData>
+                  </a:graphic>
+                </wp:inline>
+              </w:drawing>
+            </w:r>
+          </w:p>
+        </w:tc>
+      </w:tr>
+      <w:tr>
+        <w:tc>
+          <w:tcPr>
+            <w:tcW w:w="4531" w:type="dxa"/>
+          </w:tcPr>
+          <w:p>
+            <w:pPr>
+              <w:jc w:val="center"/>
+            </w:pPr>
+          </w:p>
+        </w:tc>
+        <w:tc>
+          <w:tcPr>
+            <w:tcW w:w="4531" w:type="dxa"/>
+          </w:tcPr>
+          <w:p>
+            <w:pPr>
+              <w:jc w:val="center"/>
+            </w:pPr>
+          </w:p>
+        </w:tc>
+      </w:tr>
+      <w:tr>
+        <w:tc>
+          <w:tcPr>
+            <w:tcW w:w="4531" w:type="dxa"/>
+          </w:tcPr>
+          <w:p>
+            <w:pPr>
+              <w:jc w:val="center"/>
+            </w:pPr>
+            <w:r>
+              <w:lastRenderedPageBreak/>
+              <w:t>Imposter An/Aus</w:t>
+            </w:r>
+          </w:p>
+        </w:tc>
+        <w:tc>
+          <w:tcPr>
+            <w:tcW w:w="4531" w:type="dxa"/>
+          </w:tcPr>
+          <w:p>
+            <w:pPr>
+              <w:jc w:val="center"/>
+            </w:pPr>
+            <w:r>
+              <w:drawing>
+                <wp:inline distT="0" distB="0" distL="0" distR="0" wp14:anchorId="2759A51C" wp14:editId="013A233F">
+                  <wp:extent cx="2001116" cy="2033170"/>
+                  <wp:effectExtent l="0" t="0" r="0" b="5715"/>
+                  <wp:docPr id="10" name="Grafik 10"/>
+                  <wp:cNvGraphicFramePr>
+                    <a:graphicFrameLocks xmlns:a="http://schemas.openxmlformats.org/drawingml/2006/main" noChangeAspect="1"/>
+                  </wp:cNvGraphicFramePr>
+                  <a:graphic xmlns:a="http://schemas.openxmlformats.org/drawingml/2006/main">
+                    <a:graphicData uri="http://schemas.openxmlformats.org/drawingml/2006/picture">
+                      <pic:pic xmlns:pic="http://schemas.openxmlformats.org/drawingml/2006/picture">
+                        <pic:nvPicPr>
+                          <pic:cNvPr id="1" name=""/>
+                          <pic:cNvPicPr/>
+                        </pic:nvPicPr>
+                        <pic:blipFill>
+                          <a:blip r:embed="rId13"/>
+                          <a:stretch>
+                            <a:fillRect/>
+                          </a:stretch>
+                        </pic:blipFill>
+                        <pic:spPr>
+                          <a:xfrm>
+                            <a:off x="0" y="0"/>
+                            <a:ext cx="2008113" cy="2040279"/>
+                          </a:xfrm>
+                          <a:prstGeom prst="rect">
+                            <a:avLst/>
+                          </a:prstGeom>
+                        </pic:spPr>
+                      </pic:pic>
+                    </a:graphicData>
+                  </a:graphic>
+                </wp:inline>
+              </w:drawing>
+            </w:r>
+          </w:p>
+        </w:tc>
+      </w:tr>
+      <w:tr>
+        <w:tc>
+          <w:tcPr>
+            <w:tcW w:w="4531" w:type="dxa"/>
+          </w:tcPr>
+          <w:p>
+            <w:pPr>
+              <w:jc w:val="center"/>
+            </w:pPr>
+          </w:p>
+        </w:tc>
+        <w:tc>
+          <w:tcPr>
+            <w:tcW w:w="4531" w:type="dxa"/>
+          </w:tcPr>
+          <w:p>
+            <w:pPr>
+              <w:jc w:val="center"/>
+            </w:pPr>
+          </w:p>
+        </w:tc>
+      </w:tr>
+      <w:tr>
+        <w:tc>
+          <w:tcPr>
+            <w:tcW w:w="4531" w:type="dxa"/>
+          </w:tcPr>
+          <w:p>
+            <w:pPr>
+              <w:jc w:val="center"/>
+            </w:pPr>
+          </w:p>
+        </w:tc>
+        <w:tc>
+          <w:tcPr>
+            <w:tcW w:w="4531" w:type="dxa"/>
+          </w:tcPr>
+          <w:p>
+            <w:pPr>
+              <w:jc w:val="center"/>
+            </w:pPr>
+          </w:p>
+        </w:tc>
+      </w:tr>
+      <w:tr>
+        <w:tc>
+          <w:tcPr>
+            <w:tcW w:w="4531" w:type="dxa"/>
+          </w:tcPr>
+          <w:p>
+            <w:pPr>
+              <w:jc w:val="center"/>
+            </w:pPr>
+          </w:p>
+        </w:tc>
+        <w:tc>
+          <w:tcPr>
+            <w:tcW w:w="4531" w:type="dxa"/>
+          </w:tcPr>
+          <w:p>
+            <w:pPr>
+              <w:jc w:val="center"/>
+            </w:pPr>
+          </w:p>
+        </w:tc>
+      </w:tr>
+      <w:tr>
+        <w:tc>
+          <w:tcPr>
+            <w:tcW w:w="4531" w:type="dxa"/>
+          </w:tcPr>
+          <w:p>
+            <w:pPr>
+              <w:jc w:val="center"/>
+            </w:pPr>
+          </w:p>
+        </w:tc>
+        <w:tc>
+          <w:tcPr>
+            <w:tcW w:w="4531" w:type="dxa"/>
+          </w:tcPr>
+          <w:p>
+            <w:pPr>
+              <w:jc w:val="center"/>
+            </w:pPr>
+          </w:p>
+        </w:tc>
+      </w:tr>
+      <w:tr>
+        <w:tc>
+          <w:tcPr>
+            <w:tcW w:w="4531" w:type="dxa"/>
+          </w:tcPr>
+          <w:p>
+            <w:pPr>
+              <w:jc w:val="center"/>
+            </w:pPr>
+          </w:p>
+        </w:tc>
+        <w:tc>
+          <w:tcPr>
+            <w:tcW w:w="4531" w:type="dxa"/>
+          </w:tcPr>
+          <w:p>
+            <w:pPr>
+              <w:jc w:val="center"/>
+            </w:pPr>
+          </w:p>
+        </w:tc>
+      </w:tr>
+      <w:tr>
+        <w:tc>
+          <w:tcPr>
+            <w:tcW w:w="4531" w:type="dxa"/>
+          </w:tcPr>
+          <w:p>
+            <w:pPr>
+              <w:jc w:val="center"/>
+            </w:pPr>
+          </w:p>
+        </w:tc>
+        <w:tc>
+          <w:tcPr>
+            <w:tcW w:w="4531" w:type="dxa"/>
+          </w:tcPr>
+          <w:p>
+            <w:pPr>
+              <w:jc w:val="center"/>
+            </w:pPr>
+          </w:p>
+        </w:tc>
+      </w:tr>
+      <w:tr>
+        <w:tc>
+          <w:tcPr>
+            <w:tcW w:w="4531" w:type="dxa"/>
+          </w:tcPr>
+          <w:p>
+            <w:pPr>
+              <w:jc w:val="center"/>
+            </w:pPr>
+          </w:p>
+        </w:tc>
+        <w:tc>
+          <w:tcPr>
+            <w:tcW w:w="4531" w:type="dxa"/>
+          </w:tcPr>
+          <w:p>
+            <w:pPr>
+              <w:jc w:val="center"/>
+            </w:pPr>
+          </w:p>
+        </w:tc>
+      </w:tr>
+      <w:tr>
+        <w:tc>
+          <w:tcPr>
+            <w:tcW w:w="4531" w:type="dxa"/>
+          </w:tcPr>
+          <w:p>
+            <w:pPr>
+              <w:jc w:val="center"/>
+            </w:pPr>
+          </w:p>
+        </w:tc>
+        <w:tc>
+          <w:tcPr>
+            <w:tcW w:w="4531" w:type="dxa"/>
+          </w:tcPr>
+          <w:p>
+            <w:pPr>
+              <w:jc w:val="center"/>
+            </w:pPr>
+          </w:p>
+        </w:tc>
+      </w:tr>
+      <w:tr>
+        <w:tc>
+          <w:tcPr>
+            <w:tcW w:w="4531" w:type="dxa"/>
+          </w:tcPr>
+          <w:p>
+            <w:pPr>
+              <w:jc w:val="center"/>
+            </w:pPr>
+          </w:p>
+        </w:tc>
+        <w:tc>
+          <w:tcPr>
+            <w:tcW w:w="4531" w:type="dxa"/>
+          </w:tcPr>
+          <w:p>
+            <w:pPr>
+              <w:jc w:val="center"/>
+            </w:pPr>
+          </w:p>
+        </w:tc>
+      </w:tr>
+      <w:tr>
+        <w:tc>
+          <w:tcPr>
+            <w:tcW w:w="4531" w:type="dxa"/>
+          </w:tcPr>
+          <w:p>
+            <w:pPr>
+              <w:jc w:val="center"/>
+            </w:pPr>
+          </w:p>
+        </w:tc>
+        <w:tc>
+          <w:tcPr>
+            <w:tcW w:w="4531" w:type="dxa"/>
+          </w:tcPr>
+          <w:p>
+            <w:pPr>
+              <w:jc w:val="center"/>
+            </w:pPr>
+          </w:p>
         </w:tc>
       </w:tr>
     </w:tbl>
-    <w:p/>
+    <w:p>
+      <w:pPr>
+        <w:jc w:val="center"/>
+      </w:pPr>
+    </w:p>
     <w:sectPr>
       <w:pgSz w:w="11906" w:h="16838"/>
       <w:pgMar w:top="1417" w:right="1417" w:bottom="1134" w:left="1417" w:header="708" w:footer="708" w:gutter="0"/>

</xml_diff>